<commit_message>
Update document about JAWS SayBottomLine
</commit_message>
<xml_diff>
--- a/Documentation/ToDO liste. Gældende version Ekstra information/Error 1016 JAWS Error reading status line by JAWS PageDown.docx
+++ b/Documentation/ToDO liste. Gældende version Ekstra information/Error 1016 JAWS Error reading status line by JAWS PageDown.docx
@@ -1469,6 +1469,505 @@
         <w:t>How can JAWS fint smb ind dbtx files in \enu and our own in \dan</w:t>
       </w:r>
     </w:p>
+    <w:p>
+      <w:pPr>
+        <w:pStyle w:val="Normal"/>
+        <w:bidi w:val="0"/>
+        <w:jc w:val="left"/>
+        <w:rPr/>
+      </w:pPr>
+      <w:r>
+        <w:rPr/>
+      </w:r>
+    </w:p>
+    <w:p>
+      <w:pPr>
+        <w:pStyle w:val="Normal"/>
+        <w:bidi w:val="0"/>
+        <w:jc w:val="left"/>
+        <w:rPr>
+          <w:b/>
+          <w:bCs/>
+        </w:rPr>
+      </w:pPr>
+      <w:r>
+        <w:rPr>
+          <w:b/>
+          <w:bCs/>
+        </w:rPr>
+        <w:t>November 2024</w:t>
+      </w:r>
+    </w:p>
+    <w:p>
+      <w:pPr>
+        <w:pStyle w:val="Normal"/>
+        <w:bidi w:val="0"/>
+        <w:jc w:val="left"/>
+        <w:rPr/>
+      </w:pPr>
+      <w:r>
+        <w:rPr/>
+      </w:r>
+    </w:p>
+    <w:p>
+      <w:pPr>
+        <w:pStyle w:val="Normal"/>
+        <w:bidi w:val="0"/>
+        <w:jc w:val="left"/>
+        <w:rPr/>
+      </w:pPr>
+      <w:r>
+        <w:rPr/>
+      </w:r>
+    </w:p>
+    <w:p>
+      <w:pPr>
+        <w:pStyle w:val="Normal"/>
+        <w:bidi w:val="0"/>
+        <w:jc w:val="left"/>
+        <w:rPr/>
+      </w:pPr>
+      <w:r>
+        <w:rPr/>
+        <w:t>Several solutions have now been investigated:</w:t>
+      </w:r>
+    </w:p>
+    <w:p>
+      <w:pPr>
+        <w:pStyle w:val="Normal"/>
+        <w:bidi w:val="0"/>
+        <w:jc w:val="left"/>
+        <w:rPr/>
+      </w:pPr>
+      <w:r>
+        <w:rPr/>
+      </w:r>
+    </w:p>
+    <w:tbl>
+      <w:tblPr>
+        <w:tblW w:w="5000" w:type="pct"/>
+        <w:jc w:val="left"/>
+        <w:tblInd w:w="0" w:type="dxa"/>
+        <w:tblLayout w:type="fixed"/>
+        <w:tblCellMar>
+          <w:top w:w="0" w:type="dxa"/>
+          <w:left w:w="0" w:type="dxa"/>
+          <w:bottom w:w="0" w:type="dxa"/>
+          <w:right w:w="0" w:type="dxa"/>
+        </w:tblCellMar>
+      </w:tblPr>
+      <w:tblGrid>
+        <w:gridCol w:w="4644"/>
+        <w:gridCol w:w="4994"/>
+      </w:tblGrid>
+      <w:tr>
+        <w:trPr/>
+        <w:tc>
+          <w:tcPr>
+            <w:tcW w:w="4644" w:type="dxa"/>
+            <w:tcBorders/>
+          </w:tcPr>
+          <w:p>
+            <w:pPr>
+              <w:pStyle w:val="Tabelindhold"/>
+              <w:rPr/>
+            </w:pPr>
+            <w:r>
+              <w:rPr/>
+              <w:t>Solution</w:t>
+            </w:r>
+          </w:p>
+        </w:tc>
+        <w:tc>
+          <w:tcPr>
+            <w:tcW w:w="4994" w:type="dxa"/>
+            <w:tcBorders/>
+          </w:tcPr>
+          <w:p>
+            <w:pPr>
+              <w:pStyle w:val="Tabelindhold"/>
+              <w:rPr/>
+            </w:pPr>
+            <w:r>
+              <w:rPr/>
+              <w:t>Comment</w:t>
+            </w:r>
+          </w:p>
+        </w:tc>
+      </w:tr>
+      <w:tr>
+        <w:trPr/>
+        <w:tc>
+          <w:tcPr>
+            <w:tcW w:w="4644" w:type="dxa"/>
+            <w:tcBorders/>
+          </w:tcPr>
+          <w:p>
+            <w:pPr>
+              <w:pStyle w:val="Tabelindhold"/>
+              <w:rPr/>
+            </w:pPr>
+            <w:r>
+              <w:rPr/>
+              <w:t>Ignore problem</w:t>
+            </w:r>
+          </w:p>
+        </w:tc>
+        <w:tc>
+          <w:tcPr>
+            <w:tcW w:w="4994" w:type="dxa"/>
+            <w:tcBorders/>
+          </w:tcPr>
+          <w:p>
+            <w:pPr>
+              <w:pStyle w:val="Tabelindhold"/>
+              <w:rPr/>
+            </w:pPr>
+            <w:r>
+              <w:rPr/>
+              <w:t>Always problemetic!!</w:t>
+            </w:r>
+          </w:p>
+        </w:tc>
+      </w:tr>
+      <w:tr>
+        <w:trPr/>
+        <w:tc>
+          <w:tcPr>
+            <w:tcW w:w="4644" w:type="dxa"/>
+            <w:tcBorders/>
+          </w:tcPr>
+          <w:p>
+            <w:pPr>
+              <w:pStyle w:val="Tabelindhold"/>
+              <w:rPr/>
+            </w:pPr>
+            <w:r>
+              <w:rPr/>
+              <w:t>Make FS include a script in next JAWS release</w:t>
+            </w:r>
+          </w:p>
+        </w:tc>
+        <w:tc>
+          <w:tcPr>
+            <w:tcW w:w="4994" w:type="dxa"/>
+            <w:tcBorders/>
+          </w:tcPr>
+          <w:p>
+            <w:pPr>
+              <w:pStyle w:val="Tabelindhold"/>
+              <w:rPr/>
+            </w:pPr>
+            <w:r>
+              <w:rPr/>
+              <w:t>Time consuming and introduces dependencies.</w:t>
+            </w:r>
+          </w:p>
+          <w:p>
+            <w:pPr>
+              <w:pStyle w:val="Tabelindhold"/>
+              <w:rPr/>
+            </w:pPr>
+            <w:r>
+              <w:rPr/>
+              <w:t>Much better to make FS realise that they have an error!</w:t>
+            </w:r>
+          </w:p>
+        </w:tc>
+      </w:tr>
+      <w:tr>
+        <w:trPr/>
+        <w:tc>
+          <w:tcPr>
+            <w:tcW w:w="4644" w:type="dxa"/>
+            <w:tcBorders/>
+          </w:tcPr>
+          <w:p>
+            <w:pPr>
+              <w:pStyle w:val="Tabelindhold"/>
+              <w:rPr/>
+            </w:pPr>
+            <w:r>
+              <w:rPr/>
+              <w:t>Add a script to own installation and install as a shared script from inside our own application</w:t>
+            </w:r>
+          </w:p>
+        </w:tc>
+        <w:tc>
+          <w:tcPr>
+            <w:tcW w:w="4994" w:type="dxa"/>
+            <w:tcBorders/>
+          </w:tcPr>
+          <w:p>
+            <w:pPr>
+              <w:pStyle w:val="Tabelindhold"/>
+              <w:rPr/>
+            </w:pPr>
+            <w:r>
+              <w:rPr/>
+              <w:t>Makes us dependent of JAWS undocumented filestructure. Requires administrative rights</w:t>
+            </w:r>
+          </w:p>
+        </w:tc>
+      </w:tr>
+      <w:tr>
+        <w:trPr/>
+        <w:tc>
+          <w:tcPr>
+            <w:tcW w:w="4644" w:type="dxa"/>
+            <w:tcBorders/>
+          </w:tcPr>
+          <w:p>
+            <w:pPr>
+              <w:pStyle w:val="Tabelindhold"/>
+              <w:rPr/>
+            </w:pPr>
+            <w:r>
+              <w:rPr/>
+              <w:t>Add a script to own installation and install as a user specificscript from inside our own application</w:t>
+            </w:r>
+          </w:p>
+        </w:tc>
+        <w:tc>
+          <w:tcPr>
+            <w:tcW w:w="4994" w:type="dxa"/>
+            <w:tcBorders/>
+          </w:tcPr>
+          <w:p>
+            <w:pPr>
+              <w:pStyle w:val="Tabelindhold"/>
+              <w:rPr/>
+            </w:pPr>
+            <w:r>
+              <w:rPr/>
+              <w:t>Makes us even more dependent of dependent of JAWS undocumented filestructure.</w:t>
+            </w:r>
+          </w:p>
+          <w:p>
+            <w:pPr>
+              <w:pStyle w:val="Tabelindhold"/>
+              <w:rPr/>
+            </w:pPr>
+            <w:r>
+              <w:rPr/>
+              <w:t>But DOES NOT requires administrative rights!</w:t>
+            </w:r>
+          </w:p>
+        </w:tc>
+      </w:tr>
+      <w:tr>
+        <w:trPr/>
+        <w:tc>
+          <w:tcPr>
+            <w:tcW w:w="4644" w:type="dxa"/>
+            <w:tcBorders/>
+          </w:tcPr>
+          <w:p>
+            <w:pPr>
+              <w:pStyle w:val="Tabelindhold"/>
+              <w:rPr/>
+            </w:pPr>
+            <w:r>
+              <w:rPr/>
+              <w:t>Add our own simple mechanism ”SayStatus” using a simple keyboard shortcut similar to JAWS’ INSERT+PAGEDOWN, for instance CTRL+PAGEDOWN</w:t>
+            </w:r>
+          </w:p>
+        </w:tc>
+        <w:tc>
+          <w:tcPr>
+            <w:tcW w:w="4994" w:type="dxa"/>
+            <w:tcBorders/>
+          </w:tcPr>
+          <w:p>
+            <w:pPr>
+              <w:pStyle w:val="Tabelindhold"/>
+              <w:rPr/>
+            </w:pPr>
+            <w:r>
+              <w:rPr/>
+              <w:t>CTRL+PAGEDOWN is already used bu autoplay ar ”Decrement tempo”</w:t>
+            </w:r>
+          </w:p>
+          <w:p>
+            <w:pPr>
+              <w:pStyle w:val="Tabelindhold"/>
+              <w:rPr/>
+            </w:pPr>
+            <w:r>
+              <w:rPr/>
+              <w:t>ALT+PAGEDOWN is spoken by JAWS before it speaks the status</w:t>
+            </w:r>
+          </w:p>
+        </w:tc>
+      </w:tr>
+      <w:tr>
+        <w:trPr/>
+        <w:tc>
+          <w:tcPr>
+            <w:tcW w:w="4644" w:type="dxa"/>
+            <w:tcBorders/>
+          </w:tcPr>
+          <w:p>
+            <w:pPr>
+              <w:pStyle w:val="Tabelindhold"/>
+              <w:rPr/>
+            </w:pPr>
+            <w:r>
+              <w:rPr/>
+              <w:t>Add our own simple mechanism ”SayStatus” using a simple keyboard not related to JAWS INSERT+PAGEDOWN</w:t>
+            </w:r>
+          </w:p>
+        </w:tc>
+        <w:tc>
+          <w:tcPr>
+            <w:tcW w:w="4994" w:type="dxa"/>
+            <w:tcBorders/>
+          </w:tcPr>
+          <w:p>
+            <w:pPr>
+              <w:pStyle w:val="Tabelindhold"/>
+              <w:rPr/>
+            </w:pPr>
+            <w:r>
+              <w:rPr/>
+              <w:t>We must find a good shortcut, but this seems for the moment to be the best alternative</w:t>
+            </w:r>
+          </w:p>
+        </w:tc>
+      </w:tr>
+      <w:tr>
+        <w:trPr/>
+        <w:tc>
+          <w:tcPr>
+            <w:tcW w:w="4644" w:type="dxa"/>
+            <w:tcBorders/>
+          </w:tcPr>
+          <w:p>
+            <w:pPr>
+              <w:pStyle w:val="Tabelindhold"/>
+              <w:rPr/>
+            </w:pPr>
+            <w:r>
+              <w:rPr/>
+            </w:r>
+          </w:p>
+        </w:tc>
+        <w:tc>
+          <w:tcPr>
+            <w:tcW w:w="4994" w:type="dxa"/>
+            <w:tcBorders/>
+          </w:tcPr>
+          <w:p>
+            <w:pPr>
+              <w:pStyle w:val="Tabelindhold"/>
+              <w:rPr/>
+            </w:pPr>
+            <w:r>
+              <w:rPr/>
+            </w:r>
+          </w:p>
+        </w:tc>
+      </w:tr>
+      <w:tr>
+        <w:trPr/>
+        <w:tc>
+          <w:tcPr>
+            <w:tcW w:w="4644" w:type="dxa"/>
+            <w:tcBorders/>
+          </w:tcPr>
+          <w:p>
+            <w:pPr>
+              <w:pStyle w:val="Tabelindhold"/>
+              <w:rPr/>
+            </w:pPr>
+            <w:r>
+              <w:rPr/>
+            </w:r>
+          </w:p>
+        </w:tc>
+        <w:tc>
+          <w:tcPr>
+            <w:tcW w:w="4994" w:type="dxa"/>
+            <w:tcBorders/>
+          </w:tcPr>
+          <w:p>
+            <w:pPr>
+              <w:pStyle w:val="Tabelindhold"/>
+              <w:rPr/>
+            </w:pPr>
+            <w:r>
+              <w:rPr/>
+            </w:r>
+          </w:p>
+        </w:tc>
+      </w:tr>
+      <w:tr>
+        <w:trPr/>
+        <w:tc>
+          <w:tcPr>
+            <w:tcW w:w="4644" w:type="dxa"/>
+            <w:tcBorders/>
+          </w:tcPr>
+          <w:p>
+            <w:pPr>
+              <w:pStyle w:val="Tabelindhold"/>
+              <w:rPr/>
+            </w:pPr>
+            <w:r>
+              <w:rPr/>
+            </w:r>
+          </w:p>
+        </w:tc>
+        <w:tc>
+          <w:tcPr>
+            <w:tcW w:w="4994" w:type="dxa"/>
+            <w:tcBorders/>
+          </w:tcPr>
+          <w:p>
+            <w:pPr>
+              <w:pStyle w:val="Tabelindhold"/>
+              <w:rPr/>
+            </w:pPr>
+            <w:r>
+              <w:rPr/>
+            </w:r>
+          </w:p>
+        </w:tc>
+      </w:tr>
+      <w:tr>
+        <w:trPr/>
+        <w:tc>
+          <w:tcPr>
+            <w:tcW w:w="4644" w:type="dxa"/>
+            <w:tcBorders/>
+          </w:tcPr>
+          <w:p>
+            <w:pPr>
+              <w:pStyle w:val="Tabelindhold"/>
+              <w:rPr/>
+            </w:pPr>
+            <w:r>
+              <w:rPr/>
+            </w:r>
+          </w:p>
+        </w:tc>
+        <w:tc>
+          <w:tcPr>
+            <w:tcW w:w="4994" w:type="dxa"/>
+            <w:tcBorders/>
+          </w:tcPr>
+          <w:p>
+            <w:pPr>
+              <w:pStyle w:val="Tabelindhold"/>
+              <w:rPr/>
+            </w:pPr>
+            <w:r>
+              <w:rPr/>
+            </w:r>
+          </w:p>
+        </w:tc>
+      </w:tr>
+    </w:tbl>
     <w:p>
       <w:pPr>
         <w:pStyle w:val="Normal"/>
@@ -1998,6 +2497,29 @@
     </w:pPr>
     <w:rPr>
       <w:rFonts w:cs="Lucida Sans"/>
+    </w:rPr>
+  </w:style>
+  <w:style w:type="paragraph" w:styleId="Tabelindhold">
+    <w:name w:val="Tabelindhold"/>
+    <w:basedOn w:val="Normal"/>
+    <w:qFormat/>
+    <w:pPr>
+      <w:widowControl w:val="false"/>
+      <w:suppressLineNumbers/>
+    </w:pPr>
+    <w:rPr/>
+  </w:style>
+  <w:style w:type="paragraph" w:styleId="Tabeloverskrift">
+    <w:name w:val="Tabeloverskrift"/>
+    <w:basedOn w:val="Tabelindhold"/>
+    <w:qFormat/>
+    <w:pPr>
+      <w:suppressLineNumbers/>
+      <w:jc w:val="center"/>
+    </w:pPr>
+    <w:rPr>
+      <w:b/>
+      <w:bCs/>
     </w:rPr>
   </w:style>
 </w:styles>

</xml_diff>